<commit_message>
ESP: release NRST/BOOT0 to Hi-Z when idle so ST-Link can coexist
Root cause of CubeProgrammer 'DEV_TARGET_HELD_UNDER_RESET' and the wired-flash
.data MIS-MATCH: the ESP held NRST (and BOOT0) as strong push-pull outputs at
all times, fighting the ST-Link for the shared reset line. Now both lines idle
high-impedance (board pulldown holds BOOT0 LOW=app mode, STM32 pull-up holds
NRST HIGH=running) and are only driven during the ESP's own hardware pulse,
then released. Lets the ST-Link and ESP stay wired up simultaneously.

- stm32_flash.cpp: stm_pin_drive/stm_pin_release helpers; software entry leaves
  straps Hi-Z; hardware entry claims then releases; flash always ends Hi-Z.
- welder_main.cpp: release BOOT0 and NRST to Hi-Z after the boot self-tests.
- doc: add post-mortem section 6.5 on the shared-line contention + fix.
</commit_message>
<xml_diff>
--- a/WIRELESS_STM32_FLASH_EXPLAINED.docx
+++ b/WIRELESS_STM32_FLASH_EXPLAINED.docx
@@ -2,7 +2,7 @@
 <file path=word/document.xml><?xml version="1.0" encoding="utf-8"?>
 <w:document xmlns:w="http://schemas.openxmlformats.org/wordprocessingml/2006/main" xmlns:m="http://schemas.openxmlformats.org/officeDocument/2006/math" xmlns:r="http://schemas.openxmlformats.org/officeDocument/2006/relationships" xmlns:o="urn:schemas-microsoft-com:office:office" xmlns:v="urn:schemas-microsoft-com:vml" xmlns:w10="urn:schemas-microsoft-com:office:word" xmlns:a="http://schemas.openxmlformats.org/drawingml/2006/main" xmlns:pic="http://schemas.openxmlformats.org/drawingml/2006/picture" xmlns:wp="http://schemas.openxmlformats.org/drawingml/2006/wordprocessingDrawing">
   <w:body>
-    <w:bookmarkStart w:id="37" w:name="X4822016aa8458b52bf81ec8cbb77c5e5ed7122a"/>
+    <w:bookmarkStart w:id="38" w:name="X4822016aa8458b52bf81ec8cbb77c5e5ed7122a"/>
     <w:p>
       <w:pPr>
         <w:pStyle w:val="Heading1"/>
@@ -2454,7 +2454,7 @@
       </w:r>
     </w:p>
     <w:bookmarkEnd w:id="27"/>
-    <w:bookmarkStart w:id="33" w:name="X0589660848022ed24c405e73183884a61b087c5"/>
+    <w:bookmarkStart w:id="34" w:name="X0589660848022ed24c405e73183884a61b087c5"/>
     <w:p>
       <w:pPr>
         <w:pStyle w:val="Heading2"/>
@@ -3206,13 +3206,478 @@
       </w:r>
     </w:p>
     <w:bookmarkEnd w:id="31"/>
-    <w:bookmarkStart w:id="32" w:name="remote-debugging-latency"/>
+    <w:bookmarkStart w:id="32" w:name="Xc10928afeb3236dc6f332767232d06ba89dd89f"/>
     <w:p>
       <w:pPr>
         <w:pStyle w:val="Heading3"/>
       </w:pPr>
       <w:r>
-        <w:t xml:space="preserve">6.5 Remote debugging latency</w:t>
+        <w:t xml:space="preserve">6.5 The shared NRST/BOOT0 lines vs. the ST-Link (the wired-flash killer)</w:t>
+      </w:r>
+    </w:p>
+    <w:p>
+      <w:pPr>
+        <w:pStyle w:val="FirstParagraph"/>
+      </w:pPr>
+      <w:r>
+        <w:t xml:space="preserve">When you still flash/debug the STM32 over</w:t>
+      </w:r>
+      <w:r>
+        <w:t xml:space="preserve"> </w:t>
+      </w:r>
+      <w:r>
+        <w:rPr>
+          <w:bCs/>
+          <w:b/>
+        </w:rPr>
+        <w:t xml:space="preserve">SWD with an ST-Link</w:t>
+      </w:r>
+      <w:r>
+        <w:t xml:space="preserve">, the ST-Link</w:t>
+      </w:r>
+      <w:r>
+        <w:t xml:space="preserve"> </w:t>
+      </w:r>
+      <w:r>
+        <w:rPr>
+          <w:bCs/>
+          <w:b/>
+        </w:rPr>
+        <w:t xml:space="preserve">also drives NRST</w:t>
+      </w:r>
+      <w:r>
+        <w:t xml:space="preserve">. The ESP was holding</w:t>
+      </w:r>
+      <w:r>
+        <w:t xml:space="preserve"> </w:t>
+      </w:r>
+      <w:r>
+        <w:rPr>
+          <w:bCs/>
+          <w:b/>
+        </w:rPr>
+        <w:t xml:space="preserve">NRST and BOOT0 as strong push-pull</w:t>
+      </w:r>
+      <w:r>
+        <w:rPr>
+          <w:bCs/>
+          <w:b/>
+        </w:rPr>
+        <w:t xml:space="preserve"> </w:t>
+      </w:r>
+      <w:r>
+        <w:rPr>
+          <w:bCs/>
+          <w:b/>
+        </w:rPr>
+        <w:t xml:space="preserve">outputs at all times</w:t>
+      </w:r>
+      <w:r>
+        <w:t xml:space="preserve"> </w:t>
+      </w:r>
+      <w:r>
+        <w:t xml:space="preserve">(max drive, NRST idle-HIGH). So two masters fought over</w:t>
+      </w:r>
+      <w:r>
+        <w:t xml:space="preserve"> </w:t>
+      </w:r>
+      <w:r>
+        <w:t xml:space="preserve">the reset line:</w:t>
+      </w:r>
+    </w:p>
+    <w:p>
+      <w:pPr>
+        <w:numPr>
+          <w:ilvl w:val="0"/>
+          <w:numId w:val="1006"/>
+        </w:numPr>
+        <w:pStyle w:val="Compact"/>
+      </w:pPr>
+      <w:r>
+        <w:t xml:space="preserve">the ST-Link tried to pull NRST</w:t>
+      </w:r>
+      <w:r>
+        <w:t xml:space="preserve"> </w:t>
+      </w:r>
+      <w:r>
+        <w:rPr>
+          <w:bCs/>
+          <w:b/>
+        </w:rPr>
+        <w:t xml:space="preserve">low</w:t>
+      </w:r>
+      <w:r>
+        <w:t xml:space="preserve"> </w:t>
+      </w:r>
+      <w:r>
+        <w:t xml:space="preserve">to connect-under-reset, while</w:t>
+      </w:r>
+    </w:p>
+    <w:p>
+      <w:pPr>
+        <w:numPr>
+          <w:ilvl w:val="0"/>
+          <w:numId w:val="1006"/>
+        </w:numPr>
+        <w:pStyle w:val="Compact"/>
+      </w:pPr>
+      <w:r>
+        <w:t xml:space="preserve">the ESP shoved NRST</w:t>
+      </w:r>
+      <w:r>
+        <w:t xml:space="preserve"> </w:t>
+      </w:r>
+      <w:r>
+        <w:rPr>
+          <w:bCs/>
+          <w:b/>
+        </w:rPr>
+        <w:t xml:space="preserve">high</w:t>
+      </w:r>
+      <w:r>
+        <w:t xml:space="preserve"> </w:t>
+      </w:r>
+      <w:r>
+        <w:t xml:space="preserve">at ~40 mA.</w:t>
+      </w:r>
+    </w:p>
+    <w:p>
+      <w:pPr>
+        <w:pStyle w:val="FirstParagraph"/>
+      </w:pPr>
+      <w:r>
+        <w:t xml:space="preserve">The symptom is STM32CubeProgrammer’s</w:t>
+      </w:r>
+      <w:r>
+        <w:t xml:space="preserve"> </w:t>
+      </w:r>
+      <w:r>
+        <w:rPr>
+          <w:rStyle w:val="VerbatimChar"/>
+          <w:bCs/>
+          <w:b/>
+        </w:rPr>
+        <w:t xml:space="preserve">Error: ST-LINK error (DEV_TARGET_HELD_UNDER_RESET)</w:t>
+      </w:r>
+      <w:r>
+        <w:t xml:space="preserve"> </w:t>
+      </w:r>
+      <w:r>
+        <w:t xml:space="preserve">— and it only goes away when you</w:t>
+      </w:r>
+      <w:r>
+        <w:t xml:space="preserve"> </w:t>
+      </w:r>
+      <w:r>
+        <w:rPr>
+          <w:bCs/>
+          <w:b/>
+        </w:rPr>
+        <w:t xml:space="preserve">disconnect</w:t>
+      </w:r>
+      <w:r>
+        <w:rPr>
+          <w:bCs/>
+          <w:b/>
+        </w:rPr>
+        <w:t xml:space="preserve"> </w:t>
+      </w:r>
+      <w:r>
+        <w:rPr>
+          <w:bCs/>
+          <w:b/>
+        </w:rPr>
+        <w:t xml:space="preserve">the ESP</w:t>
+      </w:r>
+      <w:r>
+        <w:t xml:space="preserve">. Worse, this same contention can corrupt an SWD flash mid-program: a</w:t>
+      </w:r>
+      <w:r>
+        <w:t xml:space="preserve"> </w:t>
+      </w:r>
+      <w:r>
+        <w:t xml:space="preserve">GDB/CubeProgrammer</w:t>
+      </w:r>
+      <w:r>
+        <w:t xml:space="preserve"> </w:t>
+      </w:r>
+      <w:r>
+        <w:rPr>
+          <w:bCs/>
+          <w:b/>
+        </w:rPr>
+        <w:t xml:space="preserve">verify shows some sections</w:t>
+      </w:r>
+      <w:r>
+        <w:rPr>
+          <w:bCs/>
+          <w:b/>
+        </w:rPr>
+        <w:t xml:space="preserve"> </w:t>
+      </w:r>
+      <w:r>
+        <w:rPr>
+          <w:bCs/>
+          <w:b/>
+        </w:rPr>
+        <w:t xml:space="preserve">“</w:t>
+      </w:r>
+      <w:r>
+        <w:rPr>
+          <w:bCs/>
+          <w:b/>
+        </w:rPr>
+        <w:t xml:space="preserve">matched</w:t>
+      </w:r>
+      <w:r>
+        <w:rPr>
+          <w:bCs/>
+          <w:b/>
+        </w:rPr>
+        <w:t xml:space="preserve">”</w:t>
+      </w:r>
+      <w:r>
+        <w:rPr>
+          <w:bCs/>
+          <w:b/>
+        </w:rPr>
+        <w:t xml:space="preserve"> </w:t>
+      </w:r>
+      <w:r>
+        <w:rPr>
+          <w:bCs/>
+          <w:b/>
+        </w:rPr>
+        <w:t xml:space="preserve">but e.g. </w:t>
+      </w:r>
+      <w:r>
+        <w:rPr>
+          <w:rStyle w:val="VerbatimChar"/>
+          <w:bCs/>
+          <w:b/>
+        </w:rPr>
+        <w:t xml:space="preserve">.data</w:t>
+      </w:r>
+      <w:r>
+        <w:rPr>
+          <w:bCs/>
+          <w:b/>
+        </w:rPr>
+        <w:t xml:space="preserve"> </w:t>
+      </w:r>
+      <w:r>
+        <w:rPr>
+          <w:bCs/>
+          <w:b/>
+        </w:rPr>
+        <w:t xml:space="preserve">“</w:t>
+      </w:r>
+      <w:r>
+        <w:rPr>
+          <w:bCs/>
+          <w:b/>
+        </w:rPr>
+        <w:t xml:space="preserve">MIS-MATCHED!</w:t>
+      </w:r>
+      <w:r>
+        <w:rPr>
+          <w:bCs/>
+          <w:b/>
+        </w:rPr>
+        <w:t xml:space="preserve">”</w:t>
+      </w:r>
+      <w:r>
+        <w:t xml:space="preserve">, because the ST-Link couldn’t cleanly reset the target while the</w:t>
+      </w:r>
+      <w:r>
+        <w:t xml:space="preserve"> </w:t>
+      </w:r>
+      <w:r>
+        <w:t xml:space="preserve">ESP was fighting it. That partial-write looks like a mysterious</w:t>
+      </w:r>
+      <w:r>
+        <w:t xml:space="preserve"> </w:t>
+      </w:r>
+      <w:r>
+        <w:t xml:space="preserve">“</w:t>
+      </w:r>
+      <w:r>
+        <w:t xml:space="preserve">one section</w:t>
+      </w:r>
+      <w:r>
+        <w:t xml:space="preserve"> </w:t>
+      </w:r>
+      <w:r>
+        <w:t xml:space="preserve">won’t take</w:t>
+      </w:r>
+      <w:r>
+        <w:t xml:space="preserve">”</w:t>
+      </w:r>
+      <w:r>
+        <w:t xml:space="preserve"> </w:t>
+      </w:r>
+      <w:r>
+        <w:t xml:space="preserve">bug but is really a</w:t>
+      </w:r>
+      <w:r>
+        <w:t xml:space="preserve"> </w:t>
+      </w:r>
+      <w:r>
+        <w:rPr>
+          <w:bCs/>
+          <w:b/>
+        </w:rPr>
+        <w:t xml:space="preserve">two-drivers-on-one-line hardware conflict</w:t>
+      </w:r>
+      <w:r>
+        <w:t xml:space="preserve">.</w:t>
+      </w:r>
+    </w:p>
+    <w:p>
+      <w:pPr>
+        <w:pStyle w:val="BodyText"/>
+      </w:pPr>
+      <w:r>
+        <w:rPr>
+          <w:bCs/>
+          <w:b/>
+        </w:rPr>
+        <w:t xml:space="preserve">The fix:</w:t>
+      </w:r>
+      <w:r>
+        <w:t xml:space="preserve"> </w:t>
+      </w:r>
+      <w:r>
+        <w:t xml:space="preserve">the ESP now keeps</w:t>
+      </w:r>
+      <w:r>
+        <w:t xml:space="preserve"> </w:t>
+      </w:r>
+      <w:r>
+        <w:rPr>
+          <w:bCs/>
+          <w:b/>
+        </w:rPr>
+        <w:t xml:space="preserve">both NRST and BOOT0 high-impedance (Hi-Z input)</w:t>
+      </w:r>
+      <w:r>
+        <w:rPr>
+          <w:bCs/>
+          <w:b/>
+        </w:rPr>
+        <w:t xml:space="preserve"> </w:t>
+      </w:r>
+      <w:r>
+        <w:rPr>
+          <w:bCs/>
+          <w:b/>
+        </w:rPr>
+        <w:t xml:space="preserve">whenever it is not mid-flash</w:t>
+      </w:r>
+      <w:r>
+        <w:t xml:space="preserve">, and only briefly drives them during its own</w:t>
+      </w:r>
+      <w:r>
+        <w:t xml:space="preserve"> </w:t>
+      </w:r>
+      <w:r>
+        <w:t xml:space="preserve">hardware-entry / launch pulses (returning them to Hi-Z immediately after). The</w:t>
+      </w:r>
+      <w:r>
+        <w:t xml:space="preserve"> </w:t>
+      </w:r>
+      <w:r>
+        <w:t xml:space="preserve">board’s own pulls give the right idle state with the ESP off the lines:</w:t>
+      </w:r>
+    </w:p>
+    <w:p>
+      <w:pPr>
+        <w:numPr>
+          <w:ilvl w:val="0"/>
+          <w:numId w:val="1007"/>
+        </w:numPr>
+        <w:pStyle w:val="Compact"/>
+      </w:pPr>
+      <w:r>
+        <w:t xml:space="preserve">BOOT0 (PB8): 10 kΩ board pulldown → floats LOW → app mode</w:t>
+      </w:r>
+    </w:p>
+    <w:p>
+      <w:pPr>
+        <w:numPr>
+          <w:ilvl w:val="0"/>
+          <w:numId w:val="1007"/>
+        </w:numPr>
+        <w:pStyle w:val="Compact"/>
+      </w:pPr>
+      <w:r>
+        <w:t xml:space="preserve">NRST: STM32 internal ~40 kΩ pull-up → floats HIGH → not in reset</w:t>
+      </w:r>
+    </w:p>
+    <w:p>
+      <w:pPr>
+        <w:pStyle w:val="FirstParagraph"/>
+      </w:pPr>
+      <w:r>
+        <w:t xml:space="preserve">With the lines released, the</w:t>
+      </w:r>
+      <w:r>
+        <w:t xml:space="preserve"> </w:t>
+      </w:r>
+      <w:r>
+        <w:rPr>
+          <w:bCs/>
+          <w:b/>
+        </w:rPr>
+        <w:t xml:space="preserve">ST-Link and the ESP can stay wired up at the same</w:t>
+      </w:r>
+      <w:r>
+        <w:rPr>
+          <w:bCs/>
+          <w:b/>
+        </w:rPr>
+        <w:t xml:space="preserve"> </w:t>
+      </w:r>
+      <w:r>
+        <w:rPr>
+          <w:bCs/>
+          <w:b/>
+        </w:rPr>
+        <w:t xml:space="preserve">time</w:t>
+      </w:r>
+      <w:r>
+        <w:t xml:space="preserve"> </w:t>
+      </w:r>
+      <w:r>
+        <w:t xml:space="preserve">— no more</w:t>
+      </w:r>
+      <w:r>
+        <w:t xml:space="preserve"> </w:t>
+      </w:r>
+      <w:r>
+        <w:rPr>
+          <w:rStyle w:val="VerbatimChar"/>
+        </w:rPr>
+        <w:t xml:space="preserve">DEV_TARGET_HELD_UNDER_RESET</w:t>
+      </w:r>
+      <w:r>
+        <w:t xml:space="preserve">, and no more half-written SWD</w:t>
+      </w:r>
+      <w:r>
+        <w:t xml:space="preserve"> </w:t>
+      </w:r>
+      <w:r>
+        <w:t xml:space="preserve">flashes.</w:t>
+      </w:r>
+    </w:p>
+    <w:bookmarkEnd w:id="32"/>
+    <w:bookmarkStart w:id="33" w:name="remote-debugging-latency"/>
+    <w:p>
+      <w:pPr>
+        <w:pStyle w:val="Heading3"/>
+      </w:pPr>
+      <w:r>
+        <w:t xml:space="preserve">6.6 Remote debugging latency</w:t>
       </w:r>
     </w:p>
     <w:p>
@@ -3277,9 +3742,9 @@
         </w:pict>
       </w:r>
     </w:p>
-    <w:bookmarkEnd w:id="32"/>
     <w:bookmarkEnd w:id="33"/>
-    <w:bookmarkStart w:id="35" w:name="Xfcf986878304d8f2692acb8eabfd2e9ac0bdffa"/>
+    <w:bookmarkEnd w:id="34"/>
+    <w:bookmarkStart w:id="36" w:name="Xfcf986878304d8f2692acb8eabfd2e9ac0bdffa"/>
     <w:p>
       <w:pPr>
         <w:pStyle w:val="Heading2"/>
@@ -3659,7 +4124,7 @@
       <w:pPr>
         <w:numPr>
           <w:ilvl w:val="0"/>
-          <w:numId w:val="1006"/>
+          <w:numId w:val="1008"/>
         </w:numPr>
         <w:pStyle w:val="Compact"/>
       </w:pPr>
@@ -3697,7 +4162,7 @@
       <w:pPr>
         <w:numPr>
           <w:ilvl w:val="0"/>
-          <w:numId w:val="1006"/>
+          <w:numId w:val="1008"/>
         </w:numPr>
         <w:pStyle w:val="Compact"/>
       </w:pPr>
@@ -3735,7 +4200,7 @@
       <w:pPr>
         <w:numPr>
           <w:ilvl w:val="0"/>
-          <w:numId w:val="1006"/>
+          <w:numId w:val="1008"/>
         </w:numPr>
         <w:pStyle w:val="Compact"/>
       </w:pPr>
@@ -3769,7 +4234,7 @@
         <w:t xml:space="preserve">(early jump skipped).</w:t>
       </w:r>
     </w:p>
-    <w:bookmarkStart w:id="34" w:name="how-to-use-it"/>
+    <w:bookmarkStart w:id="35" w:name="how-to-use-it"/>
     <w:p>
       <w:pPr>
         <w:pStyle w:val="Heading3"/>
@@ -3782,7 +4247,7 @@
       <w:pPr>
         <w:numPr>
           <w:ilvl w:val="0"/>
-          <w:numId w:val="1007"/>
+          <w:numId w:val="1009"/>
         </w:numPr>
         <w:pStyle w:val="Compact"/>
       </w:pPr>
@@ -3803,7 +4268,7 @@
       <w:pPr>
         <w:numPr>
           <w:ilvl w:val="0"/>
-          <w:numId w:val="1007"/>
+          <w:numId w:val="1009"/>
         </w:numPr>
         <w:pStyle w:val="Compact"/>
       </w:pPr>
@@ -3859,7 +4324,7 @@
       <w:pPr>
         <w:numPr>
           <w:ilvl w:val="0"/>
-          <w:numId w:val="1007"/>
+          <w:numId w:val="1009"/>
         </w:numPr>
         <w:pStyle w:val="Compact"/>
       </w:pPr>
@@ -3895,9 +4360,9 @@
         </w:pict>
       </w:r>
     </w:p>
-    <w:bookmarkEnd w:id="34"/>
     <w:bookmarkEnd w:id="35"/>
-    <w:bookmarkStart w:id="36" w:name="quick-reference"/>
+    <w:bookmarkEnd w:id="36"/>
+    <w:bookmarkStart w:id="37" w:name="quick-reference"/>
     <w:p>
       <w:pPr>
         <w:pStyle w:val="Heading2"/>
@@ -4509,8 +4974,8 @@
         </w:tc>
       </w:tr>
     </w:tbl>
-    <w:bookmarkEnd w:id="36"/>
     <w:bookmarkEnd w:id="37"/>
+    <w:bookmarkEnd w:id="38"/>
     <w:sectPr/>
   </w:body>
 </w:document>
@@ -4908,6 +5373,12 @@
     <w:abstractNumId w:val="991"/>
   </w:num>
   <w:num w:numId="1007">
+    <w:abstractNumId w:val="991"/>
+  </w:num>
+  <w:num w:numId="1008">
+    <w:abstractNumId w:val="991"/>
+  </w:num>
+  <w:num w:numId="1009">
     <w:abstractNumId w:val="99411"/>
     <w:lvlOverride w:ilvl="0">
       <w:startOverride w:val="1"/>

</xml_diff>

<commit_message>
STM32: drive BOOT0 HIGH before reset for software ROM entry (stage 3 fix)
Breadcrumb revealed stage 3/3: the jump executed, but the ROM stayed silent on
USART1. Root cause: the ROM bootloader checks BOOT0 when it starts, even if we
jumped via VTOR. BOOT0=LOW -> ROM exits or waits on USB/I2C, not USART1.

Fix: before the warm reset in requestBootloaderReset(), drive PB8 (BOOT0) HIGH
via GPIO push-pull. The 10k board pulldown is easily overcome. When the ROM
starts it samples BOOT0=HIGH -> stays in bootloader mode, responds on USART1.

This completes the software 2-wire wireless flash path - no ESP BOOT0/NRST wires
needed, the STM32 controls its own BOOT0 internally.

- main.c: enable GPIOB clock, init PB8 as push-pull output, drive HIGH, DSB.
- doc: add stage-3 diagnosis + BOOT0 fix explanation to section 7.
- boot banner: v5-BOOT0-DRIVE-TEST (to confirm the new firmware is running).
</commit_message>
<xml_diff>
--- a/WIRELESS_STM32_FLASH_EXPLAINED.docx
+++ b/WIRELESS_STM32_FLASH_EXPLAINED.docx
@@ -2,7 +2,7 @@
 <file path=word/document.xml><?xml version="1.0" encoding="utf-8"?>
 <w:document xmlns:w="http://schemas.openxmlformats.org/wordprocessingml/2006/main" xmlns:m="http://schemas.openxmlformats.org/officeDocument/2006/math" xmlns:r="http://schemas.openxmlformats.org/officeDocument/2006/relationships" xmlns:o="urn:schemas-microsoft-com:office:office" xmlns:v="urn:schemas-microsoft-com:vml" xmlns:w10="urn:schemas-microsoft-com:office:word" xmlns:a="http://schemas.openxmlformats.org/drawingml/2006/main" xmlns:pic="http://schemas.openxmlformats.org/drawingml/2006/picture" xmlns:wp="http://schemas.openxmlformats.org/drawingml/2006/wordprocessingDrawing">
   <w:body>
-    <w:bookmarkStart w:id="38" w:name="X4822016aa8458b52bf81ec8cbb77c5e5ed7122a"/>
+    <w:bookmarkStart w:id="39" w:name="X4822016aa8458b52bf81ec8cbb77c5e5ed7122a"/>
     <w:p>
       <w:pPr>
         <w:pStyle w:val="Heading1"/>
@@ -3744,7 +3744,7 @@
     </w:p>
     <w:bookmarkEnd w:id="33"/>
     <w:bookmarkEnd w:id="34"/>
-    <w:bookmarkStart w:id="36" w:name="Xfcf986878304d8f2692acb8eabfd2e9ac0bdffa"/>
+    <w:bookmarkStart w:id="37" w:name="Xfcf986878304d8f2692acb8eabfd2e9ac0bdffa"/>
     <w:p>
       <w:pPr>
         <w:pStyle w:val="Heading2"/>
@@ -4353,6 +4353,270 @@
         <w:t xml:space="preserve">exactly which sub‑problem to fix next.</w:t>
       </w:r>
     </w:p>
+    <w:bookmarkEnd w:id="35"/>
+    <w:bookmarkStart w:id="36" w:name="X509b533c2ef6234a674ac04984140ba376c7d64"/>
+    <w:p>
+      <w:pPr>
+        <w:pStyle w:val="Heading3"/>
+      </w:pPr>
+      <w:r>
+        <w:t xml:space="preserve">Stage 3 revealed the answer → the BOOT0 fix</w:t>
+      </w:r>
+    </w:p>
+    <w:p>
+      <w:pPr>
+        <w:pStyle w:val="FirstParagraph"/>
+      </w:pPr>
+      <w:r>
+        <w:t xml:space="preserve">Field testing showed</w:t>
+      </w:r>
+      <w:r>
+        <w:t xml:space="preserve"> </w:t>
+      </w:r>
+      <w:r>
+        <w:rPr>
+          <w:bCs/>
+          <w:b/>
+        </w:rPr>
+        <w:t xml:space="preserve">stage 3/3</w:t>
+      </w:r>
+      <w:r>
+        <w:t xml:space="preserve"> </w:t>
+      </w:r>
+      <w:r>
+        <w:t xml:space="preserve">— the jump to ROM executed successfully, but</w:t>
+      </w:r>
+      <w:r>
+        <w:t xml:space="preserve"> </w:t>
+      </w:r>
+      <w:r>
+        <w:t xml:space="preserve">the ROM stayed silent on USART1. The ESP received bytes (</w:t>
+      </w:r>
+      <w:r>
+        <w:rPr>
+          <w:rStyle w:val="VerbatimChar"/>
+        </w:rPr>
+        <w:t xml:space="preserve">0x00</w:t>
+      </w:r>
+      <w:r>
+        <w:t xml:space="preserve">,</w:t>
+      </w:r>
+      <w:r>
+        <w:t xml:space="preserve"> </w:t>
+      </w:r>
+      <w:r>
+        <w:rPr>
+          <w:rStyle w:val="VerbatimChar"/>
+        </w:rPr>
+        <w:t xml:space="preserve">0x1B</w:t>
+      </w:r>
+      <w:r>
+        <w:t xml:space="preserve">) but not</w:t>
+      </w:r>
+      <w:r>
+        <w:t xml:space="preserve"> </w:t>
+      </w:r>
+      <w:r>
+        <w:t xml:space="preserve">the</w:t>
+      </w:r>
+      <w:r>
+        <w:t xml:space="preserve"> </w:t>
+      </w:r>
+      <w:r>
+        <w:rPr>
+          <w:rStyle w:val="VerbatimChar"/>
+        </w:rPr>
+        <w:t xml:space="preserve">0x79</w:t>
+      </w:r>
+      <w:r>
+        <w:t xml:space="preserve"> </w:t>
+      </w:r>
+      <w:r>
+        <w:t xml:space="preserve">ACK.</w:t>
+      </w:r>
+    </w:p>
+    <w:p>
+      <w:pPr>
+        <w:pStyle w:val="BodyText"/>
+      </w:pPr>
+      <w:r>
+        <w:rPr>
+          <w:bCs/>
+          <w:b/>
+        </w:rPr>
+        <w:t xml:space="preserve">Root cause:</w:t>
+      </w:r>
+      <w:r>
+        <w:t xml:space="preserve"> </w:t>
+      </w:r>
+      <w:r>
+        <w:t xml:space="preserve">the ROM bootloader</w:t>
+      </w:r>
+      <w:r>
+        <w:t xml:space="preserve"> </w:t>
+      </w:r>
+      <w:r>
+        <w:rPr>
+          <w:bCs/>
+          <w:b/>
+        </w:rPr>
+        <w:t xml:space="preserve">checks BOOT0 when it starts</w:t>
+      </w:r>
+      <w:r>
+        <w:t xml:space="preserve">, even if we</w:t>
+      </w:r>
+      <w:r>
+        <w:t xml:space="preserve"> </w:t>
+      </w:r>
+      <w:r>
+        <w:t xml:space="preserve">jumped to it via VTOR/MSP. If BOOT0 is LOW the ROM either:</w:t>
+      </w:r>
+      <w:r>
+        <w:t xml:space="preserve"> </w:t>
+      </w:r>
+      <w:r>
+        <w:t xml:space="preserve">- exits back to app mode immediately (thinking</w:t>
+      </w:r>
+      <w:r>
+        <w:t xml:space="preserve"> </w:t>
+      </w:r>
+      <w:r>
+        <w:t xml:space="preserve">“</w:t>
+      </w:r>
+      <w:r>
+        <w:t xml:space="preserve">no bootloader requested</w:t>
+      </w:r>
+      <w:r>
+        <w:t xml:space="preserve">”</w:t>
+      </w:r>
+      <w:r>
+        <w:t xml:space="preserve">), OR</w:t>
+      </w:r>
+      <w:r>
+        <w:t xml:space="preserve"> </w:t>
+      </w:r>
+      <w:r>
+        <w:t xml:space="preserve">- waits on USB/I2C instead of USART1 (based on pin sampling per AN2606).</w:t>
+      </w:r>
+    </w:p>
+    <w:p>
+      <w:pPr>
+        <w:pStyle w:val="BodyText"/>
+      </w:pPr>
+      <w:r>
+        <w:rPr>
+          <w:bCs/>
+          <w:b/>
+        </w:rPr>
+        <w:t xml:space="preserve">The fix:</w:t>
+      </w:r>
+      <w:r>
+        <w:t xml:space="preserve"> </w:t>
+      </w:r>
+      <w:r>
+        <w:t xml:space="preserve">before the warm reset in</w:t>
+      </w:r>
+      <w:r>
+        <w:t xml:space="preserve"> </w:t>
+      </w:r>
+      <w:r>
+        <w:rPr>
+          <w:rStyle w:val="VerbatimChar"/>
+        </w:rPr>
+        <w:t xml:space="preserve">requestBootloaderReset()</w:t>
+      </w:r>
+      <w:r>
+        <w:t xml:space="preserve">, the STM32 app</w:t>
+      </w:r>
+      <w:r>
+        <w:t xml:space="preserve"> </w:t>
+      </w:r>
+      <w:r>
+        <w:t xml:space="preserve">now</w:t>
+      </w:r>
+      <w:r>
+        <w:t xml:space="preserve"> </w:t>
+      </w:r>
+      <w:r>
+        <w:rPr>
+          <w:bCs/>
+          <w:b/>
+        </w:rPr>
+        <w:t xml:space="preserve">drives PB8 (BOOT0) HIGH</w:t>
+      </w:r>
+      <w:r>
+        <w:t xml:space="preserve"> </w:t>
+      </w:r>
+      <w:r>
+        <w:t xml:space="preserve">via GPIO push‑pull output. The 10 kΩ board</w:t>
+      </w:r>
+      <w:r>
+        <w:t xml:space="preserve"> </w:t>
+      </w:r>
+      <w:r>
+        <w:t xml:space="preserve">pulldown on PB8 is easily overcome by a strong (20 mA+) GPIO drive. When the ROM</w:t>
+      </w:r>
+      <w:r>
+        <w:t xml:space="preserve"> </w:t>
+      </w:r>
+      <w:r>
+        <w:t xml:space="preserve">starts it samples BOOT0=HIGH →</w:t>
+      </w:r>
+      <w:r>
+        <w:t xml:space="preserve"> </w:t>
+      </w:r>
+      <w:r>
+        <w:t xml:space="preserve">“</w:t>
+      </w:r>
+      <w:r>
+        <w:t xml:space="preserve">bootloader mode requested</w:t>
+      </w:r>
+      <w:r>
+        <w:t xml:space="preserve">”</w:t>
+      </w:r>
+      <w:r>
+        <w:t xml:space="preserve"> </w:t>
+      </w:r>
+      <w:r>
+        <w:t xml:space="preserve">→ stays in ROM and</w:t>
+      </w:r>
+      <w:r>
+        <w:t xml:space="preserve"> </w:t>
+      </w:r>
+      <w:r>
+        <w:t xml:space="preserve">responds on USART1 @ 115200 8E1.</w:t>
+      </w:r>
+    </w:p>
+    <w:p>
+      <w:pPr>
+        <w:pStyle w:val="BodyText"/>
+      </w:pPr>
+      <w:r>
+        <w:t xml:space="preserve">This fix makes the</w:t>
+      </w:r>
+      <w:r>
+        <w:t xml:space="preserve"> </w:t>
+      </w:r>
+      <w:r>
+        <w:rPr>
+          <w:bCs/>
+          <w:b/>
+        </w:rPr>
+        <w:t xml:space="preserve">software 2‑wire path fully functional</w:t>
+      </w:r>
+      <w:r>
+        <w:t xml:space="preserve"> </w:t>
+      </w:r>
+      <w:r>
+        <w:t xml:space="preserve">— no ESP BOOT0/NRST</w:t>
+      </w:r>
+      <w:r>
+        <w:t xml:space="preserve"> </w:t>
+      </w:r>
+      <w:r>
+        <w:t xml:space="preserve">wires needed, the STM32 drives its own BOOT0 internally before the reset.</w:t>
+      </w:r>
+    </w:p>
     <w:p>
       <w:r>
         <w:pict>
@@ -4360,9 +4624,9 @@
         </w:pict>
       </w:r>
     </w:p>
-    <w:bookmarkEnd w:id="35"/>
     <w:bookmarkEnd w:id="36"/>
-    <w:bookmarkStart w:id="37" w:name="quick-reference"/>
+    <w:bookmarkEnd w:id="37"/>
+    <w:bookmarkStart w:id="38" w:name="quick-reference"/>
     <w:p>
       <w:pPr>
         <w:pStyle w:val="Heading2"/>
@@ -4974,8 +5238,8 @@
         </w:tc>
       </w:tr>
     </w:tbl>
-    <w:bookmarkEnd w:id="37"/>
     <w:bookmarkEnd w:id="38"/>
+    <w:bookmarkEnd w:id="39"/>
     <w:sectPr/>
   </w:body>
 </w:document>

</xml_diff>